<commit_message>
Add links to CHEM exercise to _quarto.yml; rerender.
</commit_message>
<xml_diff>
--- a/docs/exercises/ex-EVO.docx
+++ b/docs/exercises/ex-EVO.docx
@@ -47,7 +47,7 @@
       </w:r>
     </w:p>
     <w:bookmarkEnd w:id="20"/>
-    <w:bookmarkStart w:id="21" w:name="activity"/>
+    <w:bookmarkStart w:id="24" w:name="activity"/>
     <w:p>
       <w:pPr>
         <w:pStyle w:val="Heading2"/>
@@ -56,12 +56,128 @@
         <w:t xml:space="preserve">Activity</w:t>
       </w:r>
     </w:p>
+    <w:tbl>
+      <w:tblPr>
+        <w:tblStyle w:val="Table"/>
+        <w:tblLook w:firstRow="0" w:lastRow="0" w:firstColumn="0" w:lastColumn="0" w:noHBand="0" w:noVBand="0" w:val="0000"/>
+        <w:tblBorders>
+          <w:top w:val="single" w:sz="4" w:space="0" w:color="CC1914"/>
+          <w:left w:val="single" w:sz="24" w:space="0" w:color="CC1914"/>
+          <w:bottom w:val="single" w:sz="4" w:space="0" w:color="CC1914"/>
+          <w:right w:val="single" w:sz="4" w:space="0" w:color="CC1914"/>
+        </w:tblBorders>
+        <w:tblCellMar>
+          <w:left w:w="144" w:type="dxa"/>
+          <w:right w:w="144" w:type="dxa"/>
+        </w:tblCellMar>
+        <w:tblLook w:firstRow="0" w:lastRow="0" w:firstColumn="0" w:lastColumn="0" w:noHBand="0" w:noVBand="0" w:val="0000"/>
+      </w:tblPr>
+      <w:tr>
+        <w:trPr>
+          <w:cantSplit/>
+        </w:trPr>
+        <w:tc>
+          <w:tcPr>
+            <w:shd w:color="auto" w:fill="f7dddc" w:val="clear"/>
+            <w:tcMar>
+              <w:top w:w="92" w:type="dxa"/>
+              <w:bottom w:w="92" w:type="dxa"/>
+            </w:tcMar>
+          </w:tcPr>
+          <w:p>
+            <w:pPr>
+              <w:pStyle w:val="FirstParagraph"/>
+            </w:pPr>
+            <w:pPr>
+              <w:spacing w:before="0" w:after="0"/>
+              <w:textAlignment w:val="center"/>
+            </w:pPr>
+            <w:r>
+              <w:drawing>
+                <wp:inline>
+                  <wp:extent cx="152400" cy="152400"/>
+                  <wp:effectExtent b="0" l="0" r="0" t="0"/>
+                  <wp:docPr descr="" title="" id="22" name="Picture"/>
+                  <a:graphic>
+                    <a:graphicData uri="http://schemas.openxmlformats.org/drawingml/2006/picture">
+                      <pic:pic>
+                        <pic:nvPicPr>
+                          <pic:cNvPr descr="/Applications/quarto/share/formats/docx/important.png" id="23" name="Picture"/>
+                          <pic:cNvPicPr>
+                            <a:picLocks noChangeArrowheads="1" noChangeAspect="1"/>
+                          </pic:cNvPicPr>
+                        </pic:nvPicPr>
+                        <pic:blipFill>
+                          <a:blip r:embed="rId21"/>
+                          <a:stretch>
+                            <a:fillRect/>
+                          </a:stretch>
+                        </pic:blipFill>
+                        <pic:spPr bwMode="auto">
+                          <a:xfrm>
+                            <a:off x="0" y="0"/>
+                            <a:ext cx="152400" cy="152400"/>
+                          </a:xfrm>
+                          <a:prstGeom prst="rect">
+                            <a:avLst/>
+                          </a:prstGeom>
+                          <a:noFill/>
+                          <a:ln w="9525">
+                            <a:noFill/>
+                            <a:headEnd/>
+                            <a:tailEnd/>
+                          </a:ln>
+                        </pic:spPr>
+                      </pic:pic>
+                    </a:graphicData>
+                  </a:graphic>
+                </wp:inline>
+              </w:drawing>
+            </w:r>
+            <w:r>
+              <w:t xml:space="preserve"> </w:t>
+            </w:r>
+            <w:r>
+              <w:t xml:space="preserve"> </w:t>
+            </w:r>
+            <w:r>
+              <w:t xml:space="preserve">Revised</w:t>
+            </w:r>
+          </w:p>
+        </w:tc>
+      </w:tr>
+      <w:tr>
+        <w:trPr>
+          <w:cantSplit/>
+        </w:trPr>
+        <w:tc>
+          <w:tcPr>
+            <w:tcMar>
+              <w:top w:w="108" w:type="dxa"/>
+              <w:bottom w:w="108" w:type="dxa"/>
+            </w:tcMar>
+          </w:tcPr>
+          <w:p>
+            <w:pPr>
+              <w:pStyle w:val="BodyText"/>
+            </w:pPr>
+            <w:pPr>
+              <w:spacing w:before="16" w:after="16"/>
+            </w:pPr>
+            <w:r>
+              <w:t xml:space="preserve">This exercise was revised on 2026-04-09.</w:t>
+            </w:r>
+          </w:p>
+          <w:p/>
+        </w:tc>
+      </w:tr>
+    </w:tbl>
     <w:p>
       <w:pPr>
-        <w:pStyle w:val="FirstParagraph"/>
+        <w:pStyle w:val="BodyText"/>
       </w:pPr>
       <w:r>
-        <w:t xml:space="preserve">Answer the following questions in a few short sentences:</w:t>
+        <w:t xml:space="preserve">Write a short (3-5 pp) essay about how and why taking an evolutionary perspective on psychological phenomena can inform understanding. In doing so, you may wish to address some of the following points:</w:t>
       </w:r>
     </w:p>
     <w:p>
@@ -102,26 +218,18 @@
     </w:p>
     <w:p>
       <w:pPr>
-        <w:pStyle w:val="FirstParagraph"/>
-      </w:pPr>
-      <w:r>
-        <w:t xml:space="preserve">Answer the following question in a paragraph or two:</w:t>
-      </w:r>
-    </w:p>
-    <w:p>
-      <w:pPr>
         <w:pStyle w:val="Compact"/>
         <w:numPr>
           <w:ilvl w:val="0"/>
-          <w:numId w:val="1003"/>
+          <w:numId w:val="1002"/>
         </w:numPr>
       </w:pPr>
       <w:r>
         <w:t xml:space="preserve">Consider a psychological domain that interests you, is an evolutionary perspective useful? Why or why not?</w:t>
       </w:r>
     </w:p>
-    <w:bookmarkEnd w:id="21"/>
-    <w:bookmarkStart w:id="23" w:name="submission-details"/>
+    <w:bookmarkEnd w:id="24"/>
+    <w:bookmarkStart w:id="26" w:name="submission-details"/>
     <w:p>
       <w:pPr>
         <w:pStyle w:val="Heading2"/>
@@ -135,7 +243,7 @@
         <w:pStyle w:val="Compact"/>
         <w:numPr>
           <w:ilvl w:val="0"/>
-          <w:numId w:val="1004"/>
+          <w:numId w:val="1003"/>
         </w:numPr>
       </w:pPr>
       <w:r>
@@ -160,7 +268,7 @@
       <w:r>
         <w:t xml:space="preserve"> </w:t>
       </w:r>
-      <w:hyperlink r:id="rId22">
+      <w:hyperlink r:id="rId25">
         <w:r>
           <w:rPr>
             <w:rStyle w:val="Hyperlink"/>
@@ -177,7 +285,7 @@
         <w:pStyle w:val="Compact"/>
         <w:numPr>
           <w:ilvl w:val="0"/>
-          <w:numId w:val="1004"/>
+          <w:numId w:val="1003"/>
         </w:numPr>
       </w:pPr>
       <w:r>
@@ -189,14 +297,14 @@
         <w:pStyle w:val="Compact"/>
         <w:numPr>
           <w:ilvl w:val="0"/>
-          <w:numId w:val="1004"/>
+          <w:numId w:val="1003"/>
         </w:numPr>
       </w:pPr>
       <w:r>
         <w:t xml:space="preserve">If you found any resources that were especially useful to you in answering these questions, please cite them.</w:t>
       </w:r>
     </w:p>
-    <w:bookmarkEnd w:id="23"/>
+    <w:bookmarkEnd w:id="26"/>
     <w:sectPr>
       <w:footnotePr>
         <w:numRestart w:val="eachSect"/>
@@ -491,91 +599,6 @@
     </w:lvl>
     <w:lvl w:ilvl="8">
       <w:start w:val="1"/>
-      <w:numFmt w:val="decimal"/>
-      <w:lvlText w:val="%9."/>
-      <w:lvlJc w:val="left"/>
-      <w:pPr>
-        <w:ind w:left="6480" w:hanging="360"/>
-      </w:pPr>
-    </w:lvl>
-  </w:abstractNum>
-  <w:abstractNum w:abstractNumId="99414">
-    <w:nsid w:val="00A99414"/>
-    <w:multiLevelType w:val="multilevel"/>
-    <w:lvl w:ilvl="0">
-      <w:start w:val="4"/>
-      <w:numFmt w:val="decimal"/>
-      <w:lvlText w:val="%1."/>
-      <w:lvlJc w:val="left"/>
-      <w:pPr>
-        <w:ind w:left="720" w:hanging="360"/>
-      </w:pPr>
-    </w:lvl>
-    <w:lvl w:ilvl="1">
-      <w:start w:val="4"/>
-      <w:numFmt w:val="decimal"/>
-      <w:lvlText w:val="%2."/>
-      <w:lvlJc w:val="left"/>
-      <w:pPr>
-        <w:ind w:left="1440" w:hanging="360"/>
-      </w:pPr>
-    </w:lvl>
-    <w:lvl w:ilvl="2">
-      <w:start w:val="4"/>
-      <w:numFmt w:val="decimal"/>
-      <w:lvlText w:val="%3."/>
-      <w:lvlJc w:val="left"/>
-      <w:pPr>
-        <w:ind w:left="2160" w:hanging="360"/>
-      </w:pPr>
-    </w:lvl>
-    <w:lvl w:ilvl="3">
-      <w:start w:val="4"/>
-      <w:numFmt w:val="decimal"/>
-      <w:lvlText w:val="%4."/>
-      <w:lvlJc w:val="left"/>
-      <w:pPr>
-        <w:ind w:left="2880" w:hanging="360"/>
-      </w:pPr>
-    </w:lvl>
-    <w:lvl w:ilvl="4">
-      <w:start w:val="4"/>
-      <w:numFmt w:val="decimal"/>
-      <w:lvlText w:val="%5."/>
-      <w:lvlJc w:val="left"/>
-      <w:pPr>
-        <w:ind w:left="3600" w:hanging="360"/>
-      </w:pPr>
-    </w:lvl>
-    <w:lvl w:ilvl="5">
-      <w:start w:val="4"/>
-      <w:numFmt w:val="decimal"/>
-      <w:lvlText w:val="%6."/>
-      <w:lvlJc w:val="left"/>
-      <w:pPr>
-        <w:ind w:left="4320" w:hanging="360"/>
-      </w:pPr>
-    </w:lvl>
-    <w:lvl w:ilvl="6">
-      <w:start w:val="4"/>
-      <w:numFmt w:val="decimal"/>
-      <w:lvlText w:val="%7."/>
-      <w:lvlJc w:val="left"/>
-      <w:pPr>
-        <w:ind w:left="5040" w:hanging="360"/>
-      </w:pPr>
-    </w:lvl>
-    <w:lvl w:ilvl="7">
-      <w:start w:val="4"/>
-      <w:numFmt w:val="decimal"/>
-      <w:lvlText w:val="%8."/>
-      <w:lvlJc w:val="left"/>
-      <w:pPr>
-        <w:ind w:left="5760" w:hanging="360"/>
-      </w:pPr>
-    </w:lvl>
-    <w:lvl w:ilvl="8">
-      <w:start w:val="4"/>
       <w:numFmt w:val="decimal"/>
       <w:lvlText w:val="%9."/>
       <w:lvlJc w:val="left"/>
@@ -754,36 +777,6 @@
     </w:lvlOverride>
   </w:num>
   <w:num w:numId="1003">
-    <w:abstractNumId w:val="99414"/>
-    <w:lvlOverride w:ilvl="0">
-      <w:startOverride w:val="4"/>
-    </w:lvlOverride>
-    <w:lvlOverride w:ilvl="1">
-      <w:startOverride w:val="4"/>
-    </w:lvlOverride>
-    <w:lvlOverride w:ilvl="2">
-      <w:startOverride w:val="4"/>
-    </w:lvlOverride>
-    <w:lvlOverride w:ilvl="3">
-      <w:startOverride w:val="4"/>
-    </w:lvlOverride>
-    <w:lvlOverride w:ilvl="4">
-      <w:startOverride w:val="4"/>
-    </w:lvlOverride>
-    <w:lvlOverride w:ilvl="5">
-      <w:startOverride w:val="4"/>
-    </w:lvlOverride>
-    <w:lvlOverride w:ilvl="6">
-      <w:startOverride w:val="4"/>
-    </w:lvlOverride>
-    <w:lvlOverride w:ilvl="7">
-      <w:startOverride w:val="4"/>
-    </w:lvlOverride>
-    <w:lvlOverride w:ilvl="8">
-      <w:startOverride w:val="4"/>
-    </w:lvlOverride>
-  </w:num>
-  <w:num w:numId="1004">
     <w:abstractNumId w:val="991"/>
   </w:num>
 </w:numbering>

</xml_diff>